<commit_message>
docs: drop personal author lines and local box paths
final-plan / report (.md + .docx): remove the author line, strip dc:creator
from docProps/core.xml (no lastModifiedBy / company fields present), name ->
'作者本人'. phase0-results / ux-iteration-plan: no local box paths.
gen-icons.py: preview sheet goes to $ICON_PREVIEW_DIR or the temp dir.
</commit_message>
<xml_diff>
--- a/docs/final-plan.docx
+++ b/docs/final-plan.docx
@@ -29,38 +29,6 @@
           <w:rFonts w:hint="eastAsia"/>
         </w:rPr>
         <w:t xml:space="preserve">工作台：最终方案（v3）</w:t>
-      </w:r>
-    </w:p>
-    <w:p>
-      <w:pPr>
-        <w:pStyle w:val="Author"/>
-      </w:pPr>
-      <w:r>
-        <w:rPr>
-          <w:rFonts w:hint="eastAsia"/>
-        </w:rPr>
-        <w:t xml:space="preserve">为</w:t>
-      </w:r>
-      <w:r>
-        <w:t xml:space="preserve"> </w:t>
-      </w:r>
-      <w:r>
-        <w:rPr>
-          <w:rFonts w:hint="eastAsia"/>
-        </w:rPr>
-        <w:t xml:space="preserve">明明</w:t>
-      </w:r>
-      <w:r>
-        <w:t xml:space="preserve"> </w:t>
-      </w:r>
-      <w:r>
-        <w:rPr>
-          <w:rFonts w:hint="eastAsia"/>
-        </w:rPr>
-        <w:t xml:space="preserve">准备</w:t>
-      </w:r>
-      <w:r>
-        <w:t xml:space="preserve"> · Grok Bot</w:t>
       </w:r>
     </w:p>
     <w:p>
@@ -2956,7 +2924,7 @@
         <w:rPr>
           <w:rFonts w:hint="eastAsia"/>
         </w:rPr>
-        <w:t xml:space="preserve">：单个用户（明明本人或任何自用的开发者），在自己的电脑或服务器上运行，使用自己的</w:t>
+        <w:t xml:space="preserve">：单个用户（作者本人或任何自用的开发者），在自己的电脑或服务器上运行，使用自己的</w:t>
       </w:r>
       <w:r>
         <w:t xml:space="preserve"> Anthropic API </w:t>

</xml_diff>